<commit_message>
Doc upgrade + timeout
</commit_message>
<xml_diff>
--- a/Projet Puls-Events rapport technique.docx
+++ b/Projet Puls-Events rapport technique.docx
@@ -21,15 +21,7 @@
           <w:sz w:val="46"/>
           <w:szCs w:val="46"/>
         </w:rPr>
-        <w:t>R</w:t>
-      </w:r>
-      <w:r>
-        <w:rPr>
-          <w:b/>
-          <w:sz w:val="46"/>
-          <w:szCs w:val="46"/>
-        </w:rPr>
-        <w:t>apport technique – Assistant intelligent de recommandation d’événements culturels</w:t>
+        <w:t>Rapport technique – Assistant intelligent de recommandation d’événements culturels</w:t>
       </w:r>
     </w:p>
     <w:p>
@@ -1158,10 +1150,7 @@
         <w:ind w:left="360"/>
       </w:pPr>
       <w:r>
-        <w:t>(</w:t>
-      </w:r>
-      <w:r>
-        <w:t>system_prompt="""</w:t>
+        <w:t>(system_prompt="""</w:t>
       </w:r>
     </w:p>
     <w:p>
@@ -1633,10 +1622,7 @@
         <w:spacing w:after="240"/>
       </w:pPr>
       <w:r>
-        <w:t>Titre</w:t>
-      </w:r>
-      <w:r>
-        <w:t> : title</w:t>
+        <w:t>Titre : title</w:t>
       </w:r>
     </w:p>
     <w:p>
@@ -1648,13 +1634,7 @@
         <w:spacing w:after="240"/>
       </w:pPr>
       <w:r>
-        <w:t>Description</w:t>
-      </w:r>
-      <w:r>
-        <w:t xml:space="preserve"> : </w:t>
-      </w:r>
-      <w:r>
-        <w:t>texte_chunk</w:t>
+        <w:t>Description : texte_chunk</w:t>
       </w:r>
     </w:p>
     <w:p>
@@ -1666,10 +1646,7 @@
         <w:spacing w:after="240"/>
       </w:pPr>
       <w:r>
-        <w:t>Horaires :</w:t>
-      </w:r>
-      <w:r>
-        <w:t xml:space="preserve"> timings</w:t>
+        <w:t>Horaires : timings</w:t>
       </w:r>
     </w:p>
     <w:p>
@@ -1681,13 +1658,7 @@
         <w:spacing w:after="240"/>
       </w:pPr>
       <w:r>
-        <w:t>Lieu :</w:t>
-      </w:r>
-      <w:r>
-        <w:t xml:space="preserve"> </w:t>
-      </w:r>
-      <w:r>
-        <w:t>location.name</w:t>
+        <w:t>Lieu : location.name</w:t>
       </w:r>
     </w:p>
     <w:p>
@@ -1699,13 +1670,7 @@
         <w:spacing w:after="240"/>
       </w:pPr>
       <w:r>
-        <w:t>Ville :</w:t>
-      </w:r>
-      <w:r>
-        <w:t xml:space="preserve"> </w:t>
-      </w:r>
-      <w:r>
-        <w:t>location.city</w:t>
+        <w:t>Ville : location.city</w:t>
       </w:r>
     </w:p>
     <w:p>
@@ -1717,13 +1682,7 @@
         <w:spacing w:after="240"/>
       </w:pPr>
       <w:r>
-        <w:t>Région :</w:t>
-      </w:r>
-      <w:r>
-        <w:t xml:space="preserve"> </w:t>
-      </w:r>
-      <w:r>
-        <w:t>location.region</w:t>
+        <w:t>Région : location.region</w:t>
       </w:r>
     </w:p>
     <w:p>
@@ -1735,13 +1694,7 @@
         <w:spacing w:after="240"/>
       </w:pPr>
       <w:r>
-        <w:t>Adresse :</w:t>
-      </w:r>
-      <w:r>
-        <w:t xml:space="preserve"> </w:t>
-      </w:r>
-      <w:r>
-        <w:t>location.address</w:t>
+        <w:t>Adresse : location.address</w:t>
       </w:r>
       <w:r>
         <w:br/>
@@ -2085,6 +2038,62 @@
         </w:rPr>
         <w:t>Le test de rebuild est réalisé dans tests/unitaires/test_rebuild_service.py</w:t>
       </w:r>
+    </w:p>
+    <w:p>
+      <w:pPr>
+        <w:ind w:left="720"/>
+        <w:rPr>
+          <w:bCs/>
+        </w:rPr>
+      </w:pPr>
+    </w:p>
+    <w:p>
+      <w:pPr>
+        <w:ind w:left="720"/>
+        <w:rPr>
+          <w:bCs/>
+        </w:rPr>
+      </w:pPr>
+      <w:r>
+        <w:rPr>
+          <w:bCs/>
+        </w:rPr>
+        <w:drawing>
+          <wp:inline distT="0" distB="0" distL="0" distR="0" wp14:anchorId="32D2B580" wp14:editId="01C661B7">
+            <wp:extent cx="5731510" cy="2138680"/>
+            <wp:effectExtent l="0" t="0" r="2540" b="0"/>
+            <wp:docPr id="1609653024" name="Image 1"/>
+            <wp:cNvGraphicFramePr>
+              <a:graphicFrameLocks xmlns:a="http://schemas.openxmlformats.org/drawingml/2006/main" noChangeAspect="1"/>
+            </wp:cNvGraphicFramePr>
+            <a:graphic xmlns:a="http://schemas.openxmlformats.org/drawingml/2006/main">
+              <a:graphicData uri="http://schemas.openxmlformats.org/drawingml/2006/picture">
+                <pic:pic xmlns:pic="http://schemas.openxmlformats.org/drawingml/2006/picture">
+                  <pic:nvPicPr>
+                    <pic:cNvPr id="1609653024" name=""/>
+                    <pic:cNvPicPr/>
+                  </pic:nvPicPr>
+                  <pic:blipFill>
+                    <a:blip r:embed="rId6"/>
+                    <a:stretch>
+                      <a:fillRect/>
+                    </a:stretch>
+                  </pic:blipFill>
+                  <pic:spPr>
+                    <a:xfrm>
+                      <a:off x="0" y="0"/>
+                      <a:ext cx="5731510" cy="2138680"/>
+                    </a:xfrm>
+                    <a:prstGeom prst="rect">
+                      <a:avLst/>
+                    </a:prstGeom>
+                  </pic:spPr>
+                </pic:pic>
+              </a:graphicData>
+            </a:graphic>
+          </wp:inline>
+        </w:drawing>
+      </w:r>
       <w:r>
         <w:rPr>
           <w:bCs/>
@@ -2168,6 +2177,7 @@
           <w:sz w:val="34"/>
           <w:szCs w:val="34"/>
         </w:rPr>
+        <w:lastRenderedPageBreak/>
         <w:t>7. Évaluation du système</w:t>
       </w:r>
     </w:p>
@@ -2265,7 +2275,6 @@
         </w:numPr>
       </w:pPr>
       <w:r>
-        <w:lastRenderedPageBreak/>
         <w:t xml:space="preserve">Similarité sémantique : </w:t>
       </w:r>
       <w:r>
@@ -2410,6 +2419,9 @@
         <w:ind w:left="720"/>
       </w:pPr>
       <w:r>
+        <w:rPr>
+          <w:noProof/>
+        </w:rPr>
         <w:drawing>
           <wp:inline distT="0" distB="0" distL="0" distR="0" wp14:anchorId="4D957CBD" wp14:editId="09204E37">
             <wp:extent cx="5731510" cy="1603375"/>
@@ -2426,7 +2438,7 @@
                     <pic:cNvPicPr/>
                   </pic:nvPicPr>
                   <pic:blipFill>
-                    <a:blip r:embed="rId6"/>
+                    <a:blip r:embed="rId7"/>
                     <a:stretch>
                       <a:fillRect/>
                     </a:stretch>
@@ -2507,6 +2519,7 @@
         <w:spacing w:after="240"/>
       </w:pPr>
       <w:r>
+        <w:lastRenderedPageBreak/>
         <w:t>"question": "quels sont les événements culturels à Pontivy le 15 septembre 2026 ?",</w:t>
       </w:r>
     </w:p>
@@ -2519,11 +2532,7 @@
         <w:spacing w:after="240"/>
       </w:pPr>
       <w:r>
-        <w:t xml:space="preserve">  "answer": "D'après les résultats de la recherche, il n'y a **aucun événement culturel listé spécifiquement pour le 15 septembre 2026** à Pontivy.\n\nLes événements culturels trouvés à Pontivy aux alentours de cette date sont programmés dans le cadre des Journées Européennes du Patrimoine, qui se déroulent ce week-end-là :\n\n*   **Les patrimoines de l'ancien hôpital** : Samedi **19/09/2026** (10h-12h30 et 14h-17h30) et Dimanche **20/09/2026** (10h-17h30).\n*   </w:t>
-      </w:r>
-      <w:r>
-        <w:lastRenderedPageBreak/>
-        <w:t>**Le Conservatoire de Pontivy Communauté** (Portes ouvertes) : Samedi **19/09/2026** (plusieurs créneaux entre 10h30 et 16h45)."</w:t>
+        <w:t xml:space="preserve">  "answer": "D'après les résultats de la recherche, il n'y a **aucun événement culturel listé spécifiquement pour le 15 septembre 2026** à Pontivy.\n\nLes événements culturels trouvés à Pontivy aux alentours de cette date sont programmés dans le cadre des Journées Européennes du Patrimoine, qui se déroulent ce week-end-là :\n\n*   **Les patrimoines de l'ancien hôpital** : Samedi **19/09/2026** (10h-12h30 et 14h-17h30) et Dimanche **20/09/2026** (10h-17h30).\n*   **Le Conservatoire de Pontivy Communauté** (Portes ouvertes) : Samedi **19/09/2026** (plusieurs créneaux entre 10h30 et 16h45)."</w:t>
       </w:r>
     </w:p>
     <w:p>
@@ -2597,7 +2606,7 @@
         <w:ind w:left="720"/>
       </w:pPr>
       <w:r>
-        <w:t>63281345      DEPUIS LES CHAMPS — RENCONTRE               Rennes                                                   Cinéma du TNB                                                                                                                                                                                                                                                                                                                                                                                                                                                                                                                                                                                                                                                                                                                                                                                                                                                                                                                                                                                                                                                                                                                                                                                                                                                                                                                                                                                                                                                                                                                                                                                                                                                                                                                                                                                                                                                                                                                                                                                                                                                                                                                                                                                                                                                                                                                                                                                                                                                                                                                                                                                                                                                                                                                                                                                                                                                                                                                                                                                                                                                                                                                                                                                                                                                                                                                                                                                                                                                                                                                                                                                                                                                                                                                                                                                                                                                                                                                                                                                                                                                                                                                                                                                                                                                                                                                                                                                                                                                                                                                                                                                                                                                                                                                                                                                                                                                                                                                                                                                                                                                                                                                                                                                                                                                                                                                                                                                                                                                                                                                                                                                                                                                                                                                                                                                                                                                                                                                                                                                                                                                                                                                                                                                                                                                                                                                                                                                                                                                                                                                                                                                                                                                                                                                                                                                                                                                                                                                                                                                                                                                                                                                                                                                                                                                                                                                                                                                                                                                                                                                                                                                                                                                                                                                                                                                                                                                                                                                                                                                                                                                                                                                                                                                                                                                                                                                                                                                                                                                                                                                                                                                                                                                                                                                                                                                                                                                                                                                                                                                                                                                                                                                                                                                                                                                                                                                                                                                                                                                                                                                                                                                                                                                                                                                                                                                                                                                                                                                                                                                                                                                                                                                                                                                                                                                                                                                                                                                                                                                                                                                                                                                                                                                                                                                                                                                                                                                                                                                                                                                                                                                                                                                                                                                                                                                                                                                                                                                                                                                                                                                                                                                                                                                                                                                                                                                                                                                                                                                                                                                                                                                                                                                                                                                                                                                                                                                                                                                                                                                                                                                                                                                                                                                                                                                                                                                                                                                                                                                                                                                                                                                                                                                                                                                                                                                                                                                                                                                                                                                                                                                                                                                                                                                                                                                                                                                                                                                                                                                                                                                                                                                                                                                                                                                                                                                                                                                                                                                                                                                                                                                                                                                                                                                                                                                                                                                                                                                                                                                                                                                                                                                                                                                                                                                                                                                                                                                                                                                                                                                                                                                                                                                                                                                                                                                                                                                                                                                                                                                                                                                                                                                                                                                                                                                                                                                                                                                                                                                                                                                                                                                                                                                                                                                                                                                                                                                                                                                                                                                                                                                                                                                                                                                                                                                                                                                                                                                                                                                                                                                                                                                                                                                                                                                                                                                                                                                                                                                                                                                                                                                                                                                                                                                                                                                                                                                                                                                                                                                                                                                                                                                                                                                                                                                                                                                                                                                                                                                                                                                                                                                                                                                                                                                                                                                                                                                                                                                                                                                                                                                                                                                                                                                                                                                                                                                                                                                                                                                                                                                                                                                                                                                                                                                                                                                                                                                                                                                                                                                                                                                                                                                                                                                                                                                                                                                                                                                                                                                                                                                                                                                                                                                                                                                                                                                                                                                                                                                                                                                                                                                                                                                                                                                                                                                                                                                                                                                                                                                                                                                                                                                                                                                                                                                                                                                                                                                                                                                                                                                                                                                                                                                                                                                                                                                                                                                                                                                                                                                                                                                                                                                                                                                                                                                                                                                                                                                                                                                                                                                                                                                                                                                                                                                                                                                                                                                                                                                                                                                                                                                                                                                                                                                                                                                                                                                                                                                                                                                                                                                                                                                                                                                                                                                                                                                                                                                                                                                                                                                                                                                                                                                                                                                                                                                                                                                                                                                                                                                                                                                                                                                                                                                                                                                                                                                                                                                                                                                                                                                                                                                                                                                                                                                                                                                                                                                                                                                                                                                                                                                                                                                                                                                                                                                                                                                                                                                                                                                                                                                                                                                                                                                                                                                                                                                                                                                                                                                                                                                                                                                                                                                                                                                                                                                                                                                                                                                                                                                                                                                                                                                                                                                                                                                                                                                                                                                                                                                                                                                                                                                                                                                                                                                                                                                                                                                                                                                                                                                                                                                                                                                                                                                                                                                                                                                                                                                                                                                                                                                                                                                                                                                                                                                                                                                                                                                                                                                                                                                                                                                                                                                                                                                                                                                                                                                                                                                                                                                                                                                                                                                                                                                                                                                                                                                                                                                                                                                                                                                                                                                                                                                                                                                                                                                                                                                                                                                                                                                                                                                                                                                                                                                                                                                                                                                                                                                                                                                                                                                                                                                                                                                                                                                                                                                                                                                                                                                                                                                                                                                                                                                                                                                                                                                                                                                                                                                                                                                                                                                                                                                                                                                                                                                                                                                                                                                                                                                                                                                                                                                                                                                                                                                                                                                                                                                                                                                                                                                                                                                                                                                                                                                                                                                                                                                                                                                                                                                                                                                                                                                                                                                                                                                                                                                                                                                                                                                                                                                                                                                                                                                                                                                                                                                                                                                                                                                                                                                                                                                                                                                                                                                                                                                                                                                                                                                                                                                                                                                                                                                                                                                                                                                                                                                                                                                                                                                                                                                                                                                                                                                                                                                                                                                                                                                                                                                                                                                                                                                                                                                                                                                                                                                                                                                                                                                                                                                                                                                                                                                                                                                                                                                                                                                                                                                                                                                                                                                                                                                                                                                                                                                                                                                                                                                                                                                                                                                                                                                                                                                                                                                                                                                                                                                                                                                                                                                                                                                                                                                                                                                                                                                                                                                                                                                                                                                                                                                                                                                                                                                                                                                                                                                                                                                                                                                                                                                                                                                                                                                                                                                                                                                                                                                                                                                                                                                                                                                                                                                                                                                                                                                                                                                                                                                                                                                                                                                                                                                                                                                                                                                                                                                                                                                                                                                                                                                                                                                                                                                                                                                                                                                                                                                                                                                                                                                                                                                                                                                                                                                                                                                                                                                                                                                                                                                                                                                                                                                                                                                                                                                                                                                                                                                                                                                                                                                                                                                                                                                                                                                                                                                                                                                                                                                                                                                                                                                                                                                                                                                                                                                                                                                                                                                                                                                                                                                                                                                                                                                                                                                                                                                                                                                                                                                                                                                                                                                                                                                                                                                                                                                                                                                                                                                                                                                                                                                                                                                                                                                                                                                                                                                                                                                                                                                                                                                                                                                                                                                                                                                                                                                                                                                                                                                                                                                                                                                                                                                                                                                                                                                                                                                                                                                                                                                                                                                                                                                                                                                                                                                                                                                                                                                                                                                                                                                                                                                                                                                                                                                                                                                                                                                                                                                                                                                                                                                                                                                                                                                                                                                                                                                                                                                                                                                                                                                                                                                                                                                                                                                                                                                                                                                                                                                                                                                                                                                                                                                                                                                                                                                                                                                                                                                                                                                                                                                                                                                                                                                                                                                                                                                                                                                                                                                                                                                                                                                                                                                                                                                                                                                                                                                                                                                                                                                                                                                                                                                                                                                                                                                                                                                                                                                                                                                                                                                                                                                                                                                                                                                                                                                                                                                                                                                                                                                                                                                                                                                                                                                                                                                                                                                                                                                                                                                                                                                                                                                                                                                                                                                                                                                                                                                                                                                                                                                                                                                                                                                                                                                                                                                                                                                                                                                                                                                                                                                                                                                                                                                                                                                                                                                                                                                                                                                                                                                                                                                                                                                                                                                                                                                                                                                                                                                                                                                                                                                                                                                                                                                                                                                                                                                                                                                                                                                                                                                                                                                                                                                                                                                                                                                                                                                                                                                                                                                                                                                                                                                                                                                                                                                                                                                                                                                                                                                                                                                                                                                                                                                                                                                                                                                                                                                                                                                                                                                                                                                                                                                                                                                                                                                                                                                                                                                                                                                                                                                                                                                                                                                                                                                                                                                                                                                                                                                                                                                                                                                                                                                                                                                                                                                                                                                                                                                                                                                                                                                                                                                                                                                                                                                                                                                                                                                                                                                                                                                                                                                                                                                                                                                                                                                                                                                                                                                                                                                                                                                                                                                                                                                                                                                                                                                                                                                                                                                                                                                                                                                                                                                                                                                                                                                                                                                                                                                                                                                                                                                                                                                                                                                                                                                                                                                                                                                                                                                                                                                                                                                                                                                                                                                                                                                                                                                                                                                                                                                                                                                                                                                                                                                                                                                                                                                                                                                                                                                                                                                                                                                                                                                                                                                                                                                                                                                                                                                                                                                                                                                                                                                                                                                                                                                                                                                                                                                                                                                                                                                                                                                                                                                                                                                                                                                                                                                                                                                                                                                                                                                                                                                                                                                                                                                                                                                                                                                                                                                                                                                                                                                                                                                                                                                                                                                                                                                                                                                                                                                                                                                                                                                                                                                                                                                                                                                                                                                                                                                                                                                                                                                                                                                                                                                                                                                                                                                                                                                                                                                                                                                                                                                                                                                                                                                                                                                                                                                                                                                                                                                                                                                                                                                                                                                                                                                                                                                                                                                                                                                                                                                                                                                                                                                                                                                                                                                                                                                                                                                                                                                                                                                                                                                                                                                                                                                                                                                                                                                                                                                                                                                                                                                                                                                                                                                                                                                                                                                                                                                                                                                                                                                                                                                                                                                                                                                                                                                                                                                                                                                                                                                                                                                                                                                                                                                                                                                                                                                                                                                                                                                                                                                                                                                                                                                                                                                                                                                                                                                                                                                                                                                                                                                                                                                                                                                                                                                                                                                                                                                                                                                                                                                                                                                                                                                                                                                                                                                                                                                                                                                                                                                                                                                                                                                                                                                                                                                                                                                                                                                                                                                                                                                                                                                                                                                                                                                                                                                                                                                                                                                                                                                                                                                                                                                                                                                                                                                                                                                                                                                                                                                                                                                                                                                                                                                                                                                                                                                                                                                                                                                                                                                                                                                                                                                                                                                                                                                                                                                                                                                                                                                                                                                                                                                                                                                                                                                                                                                                                                                                                                                                                                                                                                                                                                                                                                                                                                                                                                                                                                                                                                                                                                                                                                                                                                                                                                                                                                                                                                                                                                                                                                                                                                                                                                                                                                                                                                                                                                                                                                                                                                                                                                                                                                                                                                                                                                                                                                                                                                                                                                                                                                                                                                                                                                                                                                                                                                                                                                                                                                                                                                                                                                                                                                                                                                                                                                                                                                                                                                                                                                                                                                                                                                                                                                                                                                                                                                                                                                                                                                                                                                                                                                                                                                                                                                                                                                                                                                                                                                                                                                                                                                                                                                                                                                                                                                                                                                                                                                                                                                                                                                                                                                                                                                                                                                                                                                                                                                                                                                                                                                                                                                                                                                                                                                                                                                                                                                                                                                                                                                                                                                                                                                                                                                                                                                                                                                                                                                                                                                                                                                                                                                                                                                                                                                                                                                                                                                                                                                                                                                                                                                                                                                                                                                                                                                                                                                                                                                                                                                                                                                                                                                                                                                                                                                                                                                                                                                                                                                                                                                                                                                                                                                                                                                                                                                                                                                                                                                                                                                                                                                                                                                                                                                                                                                                                                                                                                                                                                                                                                                                                                                                                                                                                                                                                                                                                                                                                                                                                                                                                                                                                                                                                                                                                                                                                                                                                                                                                                                                                                                                                                                                                                                                                                                                                                                                                                                                                                                                                                                                                                                                                                                                                                                                                                                                                                                                                                                                                                                                                                                                                                                                                                                                                                                                                                                                                                                                                                                                                                                                                                                                                                                                                                                                                                                                                                                                                                                                                                                                                                                                                                                                                                                                                                                                                                                                                                                                                                                                                                                                                                                                                                                                                                                                                                                                                                                                                                                                                                                                                                                                                                                                                                                                                                                                                                                                                                                                                                                                                                                                                                                                                                                                                                                                                                                                                                                                                                                                                                                                                                                                                                                                                                                                                                                                                                                                                                                                                                                                                             [{"end": "</w:t>
+        <w:t>63281345      DEPUIS LES CHAMPS — RENCONTRE               Rennes                                                   Cinéma du TNB                                                                                                                                                                                                                                                                                                                                                                                                                                                                                                                                                                                                                                                                                                                                                                                                                                                                                                                                                                                                                                                                                                                                                                                                                                                                                                                                                                                                                                                                                                                                                                                                                                                                                                                                                                                                                                                                                                                                                                                                                                                                                                                                                                                                                                                                                                                                                                                                                                                                                                                                                                                                                                                                                                                                                                                                                                                                                                                                                                                                                                                                                                                                                                                                                                                                                                                                                                                                                                                                                                                                                                                                                                                                                                                                                                                                                                                                                                                                                                                                                                                                                                                                                                                                                                                                                                                                                                                                                                                                                                                                                                                                                                                                                                                                                                                                                                                                                                                                                                                                                                                                                                                                                                                                                                                                                                                                                                                                                                                                                                                                                                                                                                                                                                                                                                                                                                                                                                                                                                                                                                                                                                                                                                                                                                                                                                                                                                                                                                                                                                                                                                                                                                                                                                                                                                                                                                                                                                                                                                                                                                                                                                                                                                                                                                                                                                                                                                                                                                                                                                                                                                                                                                                                                                                                                                                                                                                                                                                                                                                                                                                                                                                                                                                                                                                                                                                                                                                                                                                                                                                                                                                                                                                                                                                                                                                                                                                                                                                                                                                                                                                                                                                                                                                                                                                                                                                                                                                                                                                                                                                                                                                                                                                                                                                                                                                                                                                                                                                                                                                                                                                                                                                                                                                                                                                                                                                                                                                                                                                                                                                                                                                                                                                                                                                                                                                                                                                                                                                                                                                                                                                                                                                                                                                                                                                                                                                                                                                                                                                                                                                                                                                                                                                                                                                                                                                                                                                                                                                                                                                                                                                                                                                                                                                                                                                                                                                                                                                                                                                                                                                                                                                                                                                                                                                                                                                                                                                                                                                                                                                                                                                                                                                                                                                                                                                                                                                                                                                                                                                                                                                                                                                                                                                                                                                                                                                                                                                                                                                                                                                                                                                                                                                                                                                                                                                                                                                                                                                                                                                                                                                                                                                                                                                                                                                                                                                                                                                                                                                                                                                                                                                                                                                                                                                                                                                                                                                                                                                                                                                                                                                                                                                                                                                                                                                                                                                                                                                                                                                                                                                                                                                                                                                                                                                                                                                                                                                                                                                                                                                                                                                                                                                                                                                                                                                                                                                                                                                                                                                                             [{"end": "</w:t>
       </w:r>
       <w:r>
         <w:rPr>
@@ -2766,6 +2775,7 @@
         </w:numPr>
       </w:pPr>
       <w:r>
+        <w:lastRenderedPageBreak/>
         <w:t>Désactivation du mode thinking de Qwen3.8</w:t>
       </w:r>
     </w:p>
@@ -2864,6 +2874,9 @@
         <w:ind w:left="720"/>
       </w:pPr>
       <w:r>
+        <w:rPr>
+          <w:noProof/>
+        </w:rPr>
         <w:drawing>
           <wp:inline distT="0" distB="0" distL="0" distR="0" wp14:anchorId="3C1C350C" wp14:editId="212BE494">
             <wp:extent cx="1950889" cy="4694327"/>
@@ -2880,7 +2893,7 @@
                     <pic:cNvPicPr/>
                   </pic:nvPicPr>
                   <pic:blipFill>
-                    <a:blip r:embed="rId7"/>
+                    <a:blip r:embed="rId8"/>
                     <a:stretch>
                       <a:fillRect/>
                     </a:stretch>
@@ -2966,6 +2979,7 @@
         <w:rPr>
           <w:lang w:val="fr-FR"/>
         </w:rPr>
+        <w:lastRenderedPageBreak/>
         <w:t>data : contient les fichiers sources, les index Faiss, les métadonnées et le fichier test_cases de vérification des tests Ragas.</w:t>
       </w:r>
     </w:p>
@@ -3020,14 +3034,7 @@
         <w:rPr>
           <w:lang w:val="fr-FR"/>
         </w:rPr>
-        <w:t xml:space="preserve">src/services : les services de récupération des données sources, leur traitement, l'enregistrement en base vectorielle. Il contient également le service d'orchestration qui appelle Mistral pour la génération des chunks et des embeddings, l'appel au tool </w:t>
-      </w:r>
-      <w:r>
-        <w:rPr>
-          <w:lang w:val="fr-FR"/>
-        </w:rPr>
-        <w:lastRenderedPageBreak/>
-        <w:t>qui intérroge la base Faiss pour récupérer les évènements culturels ou Mistral Chat (ou Qwen3.8) pour générer des réponses et répondre si besoin en dehors du périmètre de ces évènements. Il contient enfin le service de rebuild de la base permettant de récupérer les derniers évènements.</w:t>
+        <w:t>src/services : les services de récupération des données sources, leur traitement, l'enregistrement en base vectorielle. Il contient également le service d'orchestration qui appelle Mistral pour la génération des chunks et des embeddings, l'appel au tool qui intérroge la base Faiss pour récupérer les évènements culturels ou Mistral Chat (ou Qwen3.8) pour générer des réponses et répondre si besoin en dehors du périmètre de ces évènements. Il contient enfin le service de rebuild de la base permettant de récupérer les derniers évènements.</w:t>
       </w:r>
     </w:p>
     <w:p>
@@ -4938,6 +4945,7 @@
   <w:style w:type="character" w:default="1" w:styleId="Policepardfaut">
     <w:name w:val="Default Paragraph Font"/>
     <w:uiPriority w:val="1"/>
+    <w:semiHidden/>
     <w:unhideWhenUsed/>
   </w:style>
   <w:style w:type="table" w:default="1" w:styleId="TableauNormal">

</xml_diff>